<commit_message>
Replace the three not recorded wall clocks with lower bounds in seconds
Evaluation count times median solve cost: 78 s for the free-form shell, 49 s for
the fluted dome, 107 s for the single-region fit. These are bounds, not
measurements, and the caption says so and says why - the product credits a run
with no non-converging solves, and the three runs whose wall clock survived
exceed the same bound by factors of 11, 8 and 7. The table caption now lives in
one constant and reaches the markdown as well as the docx.

Co-Authored-By: Claude Opus 5 (1M context) <noreply@anthropic.com>
</commit_message>
<xml_diff>
--- a/FDM/data/Section_6_5_1_Computational_time.docx
+++ b/FDM/data/Section_6_5_1_Computational_time.docx
@@ -641,7 +641,7 @@
               <w:rPr>
                 <w:sz w:val="16"/>
               </w:rPr>
-              <w:t>not recorded</w:t>
+              <w:t>≥ 78 s †</w:t>
             </w:r>
           </w:p>
         </w:tc>
@@ -734,7 +734,7 @@
               <w:rPr>
                 <w:sz w:val="16"/>
               </w:rPr>
-              <w:t>not recorded</w:t>
+              <w:t>≥ 49 s †</w:t>
             </w:r>
           </w:p>
         </w:tc>
@@ -827,7 +827,7 @@
               <w:rPr>
                 <w:sz w:val="16"/>
               </w:rPr>
-              <w:t>not recorded</w:t>
+              <w:t>≥ 107 s †</w:t>
             </w:r>
           </w:p>
         </w:tc>
@@ -1118,7 +1118,7 @@
           <w:i/>
           <w:sz w:val="18"/>
         </w:rPr>
-        <w:t>Table 6.X: Computational cost of the case studies. For the crease strategies the solve cost is the mean over the run itself, which is warm-started in process; entries marked * exclude the single non-converging solve discussed in the text. For the free-form shell, the fluted dome and the single-region fit it is the median over twenty-five design points about the optimum, each a cold solve. For the three region-scheme runs it is the median over the recorded run. Wall clocks marked not recorded were lost when the output files were rewritten.</w:t>
+        <w:t>Table 6.X: Computational cost of the case studies. For the crease strategies the solve cost is the mean over the run itself, which is warm-started in process; entries marked * exclude the single non-converging solve discussed in the text. For the free-form shell, the fluted dome and the single-region fit it is the median over twenty-five design points about the optimum, each a cold solve. For the three region-scheme runs it is the median over the recorded run. Wall clocks marked † were lost when the output files were rewritten and are not measurements: they are the evaluation count times the median solve cost, and therefore lower bounds, since they credit the run with no non-converging solves at all. The three measured region-scheme runs exceed the same bound by factors of 11, 8 and 7 respectively, so the true figures are plausibly of the order of ten minutes rather than one.</w:t>
       </w:r>
     </w:p>
     <w:p>

</xml_diff>

<commit_message>
Name the FDM in Section 6.5.1 instead of only spelling it out
The section discussed the force density stage at length but never used the
abbreviation, so searching the document for FDM found nothing outside file paths
in the notes. The term is now introduced at first use - the force density method
(FDM) form finding of Section 6.2 - and used thereafter, including in the
subsection heading.

Co-Authored-By: Claude Opus 5 (1M context) <noreply@anthropic.com>
</commit_message>
<xml_diff>
--- a/FDM/data/Section_6_5_1_Computational_time.docx
+++ b/FDM/data/Section_6_5_1_Computational_time.docx
@@ -23,7 +23,7 @@
         <w:jc w:val="both"/>
       </w:pPr>
       <w:r>
-        <w:t>The cost of the workflow is set almost entirely by the inner forward solve of Section 6.3.7. Everything outside it is done once per target and costs seconds: on the shell with openings the force density optimisation takes 9.3 s and the directional field 18.6 s, against the hours the inverse problem takes on the same mesh. The question is therefore what one forward solve costs, how many of them a strategy needs, and why the two do not multiply to the observed wall clock.</w:t>
+        <w:t>The cost of the workflow is set almost entirely by the inner forward solve of Section 6.3.7. Everything outside it is done once per target and costs seconds: on the shell with openings the force density method (FDM) form finding of Section 6.2 takes 9.3 s and the directional field 18.6 s, against the hours the inverse problem takes on the same mesh. The question is therefore what one forward solve costs, how many of them a strategy needs, and why the two do not multiply to the observed wall clock.</w:t>
       </w:r>
     </w:p>
     <w:p>
@@ -1198,7 +1198,7 @@
         <w:pStyle w:val="Heading3"/>
       </w:pPr>
       <w:r>
-        <w:t>What the form finding costs, and why so little</w:t>
+        <w:t>What the FDM form finding costs, and why so little</w:t>
       </w:r>
     </w:p>
     <w:p>
@@ -1206,7 +1206,7 @@
         <w:jc w:val="both"/>
       </w:pPr>
       <w:r>
-        <w:t>The inverse problem is not the only optimisation in the workflow, and the comparison with the one that precedes it is instructive, the more so because the two run on the same discretisation. The shell with openings is carried through both stages as a mesh of 847 vertices, 1563 faces and 2410 edges, of which 716 vertices are free and the remainder fixed on the boundary. On that mesh the force density stage of Section 6.2 solves for one force density per edge — 2410 design variables — and converges in 1173 L-BFGS-B iterations and 9.3 s, a mean of 7.9 ms per iteration. The inverse problem on the identical mesh carries between three and twenty design variables and takes between four minutes and three hours. The form finding therefore optimises two orders of magnitude more variables in a thousandth of the time, and none of the difference is a difference in resolution.</w:t>
+        <w:t>The inverse problem is not the only optimisation in the workflow, and the comparison with the one that precedes it is instructive, the more so because the two run on the same discretisation. The shell with openings is carried through both stages as a mesh of 847 vertices, 1563 faces and 2410 edges, of which 716 vertices are free and the remainder fixed on the boundary. On that mesh the FDM stage of Section 6.2 solves for one force density per edge — 2410 design variables — and converges in 1173 L-BFGS-B iterations and 9.3 s, a mean of 7.9 ms per iteration. The inverse problem on the identical mesh carries between three and twenty design variables and takes between four minutes and three hours. The form finding therefore optimises two orders of magnitude more variables in a thousandth of the time, and none of the difference is a difference in resolution.</w:t>
       </w:r>
     </w:p>
     <w:p>
@@ -1214,7 +1214,7 @@
         <w:jc w:val="both"/>
       </w:pPr>
       <w:r>
-        <w:t>Two things account for it, and they are worth separating because only one is intrinsic. The first is the cost of a single equilibrium solve: 6.85 ms for the force density network against 0.66 s for the membrane, a factor of about 97. That gap is intrinsic to the physics being solved. The force density equilibrium is linear in the vertex positions once the densities are fixed, so a single LU factorisation is reused across the five Picard steps that resolve the pressure coupling, whereas the membrane solve is a Newton iteration on a nonlinear material law in which cable segments change between taut and slack across four pressure continuation stages. Equal vertex counts do not imply equal cost when the equations differ in kind.</w:t>
+        <w:t>Two things account for it, and they are worth separating because only one is intrinsic. The first is the cost of a single equilibrium solve: 6.85 ms for the FDM network against 0.66 s for the membrane, a factor of about 97. That gap is intrinsic to the physics being solved. The FDM equilibrium is linear in the vertex positions once the densities are fixed, so a single LU factorisation is reused across the five Picard steps that resolve the pressure coupling, whereas the membrane solve is a Newton iteration on a nonlinear material law in which cable segments change between taut and slack across four pressure continuation stages. Equal vertex counts do not imply equal cost when the equations differ in kind.</w:t>
       </w:r>
     </w:p>
     <w:p>
@@ -1222,7 +1222,7 @@
         <w:jc w:val="both"/>
       </w:pPr>
       <w:r>
-        <w:t>The second is the cost of a gradient, and that one is an implementation choice. The force density stage differentiates its objective by an adjoint: three linear solves per iteration, one per coordinate axis, independent of the number of design variables. The inverse problem uses finite differences, at n + 1 nonlinear solves per gradient. At the sizes used here that is between three and thirty-one solves where the adjoint would be three, but the scaling is the real point. Under finite differences the form finding would need 2411 solves per gradient and some 2.8 million over its 1173 iterations; it is the adjoint alone that makes a design space of that dimension ordinary. The inverse problem tolerates finite differences because its design vector was first reduced, by the region partition and by symmetry, to a size at which the penalty is affordable rather than absent.</w:t>
+        <w:t>The second is the cost of a gradient, and that one is an implementation choice. The FDM stage differentiates its objective by an adjoint: three linear solves per iteration, one per coordinate axis, independent of the number of design variables. The inverse problem uses finite differences, at n + 1 nonlinear solves per gradient. At the sizes used here that is between three and thirty-one solves where the adjoint would be three, but the scaling is the real point. Under finite differences the form finding would need 2411 solves per gradient and some 2.8 million over its 1173 iterations; it is the adjoint alone that makes a design space of that dimension ordinary. The inverse problem tolerates finite differences because its design vector was first reduced, by the region partition and by symmetry, to a size at which the penalty is affordable rather than absent.</w:t>
       </w:r>
     </w:p>
     <w:p>
@@ -1246,7 +1246,7 @@
         <w:jc w:val="both"/>
       </w:pPr>
       <w:r>
-        <w:t>Two straightforward reductions were not implemented, and the size of the second one can be read directly off the table. The n + 1 solves of a finite-difference gradient are independent and could be dispatched across the twenty available cores, which would bring a gradient on the thirty-variable problem down to the cost of a single solve. And the subprocess driver restarts the forward solve from the undeformed configuration at every evaluation, whereas the in-process implementation of Section 6.4.1 warm-starts from the previous accepted iterate. On the same 634-element mesh a cold solve costs 0.09 s and a warm-started one between 0.010 s and 0.029 s, so the warm start is worth a factor of three to nine before any other change; the gain would be larger still at the small perturbations a finite-difference gradient takes, which is exactly where the subprocess driver throws the previous solution away. Neither change affects any result reported in this chapter, and either would move a region-refinement run from hours to minutes. A third reduction, an adjoint gradient for the membrane solve in place of finite differences, is a larger undertaking, since it requires differentiating through the Newton iteration and the switching of the cable segments between taut and slack; but it is not speculative, being the device the force density stage of this same workflow already uses, and it is the one change that would lift the ceiling on the number of design variables rather than merely lower the cost of the present ones.</w:t>
+        <w:t>Two straightforward reductions were not implemented, and the size of the second one can be read directly off the table. The n + 1 solves of a finite-difference gradient are independent and could be dispatched across the twenty available cores, which would bring a gradient on the thirty-variable problem down to the cost of a single solve. And the subprocess driver restarts the forward solve from the undeformed configuration at every evaluation, whereas the in-process implementation of Section 6.4.1 warm-starts from the previous accepted iterate. On the same 634-element mesh a cold solve costs 0.09 s and a warm-started one between 0.010 s and 0.029 s, so the warm start is worth a factor of three to nine before any other change; the gain would be larger still at the small perturbations a finite-difference gradient takes, which is exactly where the subprocess driver throws the previous solution away. Neither change affects any result reported in this chapter, and either would move a region-refinement run from hours to minutes. A third reduction, an adjoint gradient for the membrane solve in place of finite differences, is a larger undertaking, since it requires differentiating through the Newton iteration and the switching of the cable segments between taut and slack; but it is not speculative, being the device the FDM stage of this same workflow already uses, and it is the one change that would lift the ceiling on the number of design variables rather than merely lower the cost of the present ones.</w:t>
       </w:r>
     </w:p>
     <w:p>

</xml_diff>

<commit_message>
Report what the FDM stage produced, not only what it cost
The section timed the form finding without saying what the time bought. It now
carries the recorded result of the run, read from the stored D5_fdm JSON so the
numbers stay recorded rather than retyped: 1.05 mm RMS from the target, 0.086%
of the 1.215 m span, the crown to within 3 um, force densities from 0.01 to 2.40
with the lower end on the bound.

That makes a comparison possible that the chapter did not have. Both stages
report an RMS deviation from the same target: the form finding reaches 1.05 mm
in 9.3 s, the best inverse run 6.17 mm in an hour. The geometry is very nearly
attainable as a tension network, so the residual six millimetres and the hours
spent on them are the cost of materialising it in a knitted fabric, not of
finding the shape.

Co-Authored-By: Claude Opus 5 (1M context) <noreply@anthropic.com>
</commit_message>
<xml_diff>
--- a/FDM/data/Section_6_5_1_Computational_time.docx
+++ b/FDM/data/Section_6_5_1_Computational_time.docx
@@ -1206,7 +1206,7 @@
         <w:jc w:val="both"/>
       </w:pPr>
       <w:r>
-        <w:t>The inverse problem is not the only optimisation in the workflow, and the comparison with the one that precedes it is instructive, the more so because the two run on the same discretisation. The shell with openings is carried through both stages as a mesh of 847 vertices, 1563 faces and 2410 edges, of which 716 vertices are free and the remainder fixed on the boundary. On that mesh the FDM stage of Section 6.2 solves for one force density per edge — 2410 design variables — and converges in 1173 L-BFGS-B iterations and 9.3 s, a mean of 7.9 ms per iteration. The inverse problem on the identical mesh carries between three and twenty design variables and takes between four minutes and three hours. The form finding therefore optimises two orders of magnitude more variables in a thousandth of the time, and none of the difference is a difference in resolution.</w:t>
+        <w:t>The inverse problem is not the only optimisation in the workflow, and the comparison with the one that precedes it is instructive, the more so because the two run on the same discretisation. The shell with openings is carried through both stages as a mesh of 847 vertices, 1563 faces and 2410 edges, of which 716 vertices are free and the remainder fixed on the boundary. On that mesh the FDM stage of Section 6.2 solves for one force density per edge — 2410 design variables — and converges in 1173 L-BFGS-B iterations and 9.3 s, a mean of 7.9 ms per iteration. What it buys is a close fit: the form-found network sits 1.05 mm RMS from the target surface, 0.086% of the 1.215 m span, with the crown reproduced to within 3 µm, at force densities spanning 0.01 to 2.40 under unit pressure, the lower end resting on the floor imposed by the bounds. The inverse problem on the identical mesh carries between three and twenty design variables and takes between four minutes and three hours. The form finding therefore optimises two orders of magnitude more variables in a thousandth of the time, and none of the difference is a difference in resolution.</w:t>
       </w:r>
     </w:p>
     <w:p>
@@ -1223,6 +1223,14 @@
       </w:pPr>
       <w:r>
         <w:t>The second is the cost of a gradient, and that one is an implementation choice. The FDM stage differentiates its objective by an adjoint: three linear solves per iteration, one per coordinate axis, independent of the number of design variables. The inverse problem uses finite differences, at n + 1 nonlinear solves per gradient. At the sizes used here that is between three and thirty-one solves where the adjoint would be three, but the scaling is the real point. Under finite differences the form finding would need 2411 solves per gradient and some 2.8 million over its 1173 iterations; it is the adjoint alone that makes a design space of that dimension ordinary. The inverse problem tolerates finite differences because its design vector was first reduced, by the region partition and by symmetry, to a size at which the penalty is affordable rather than absent.</w:t>
+      </w:r>
+    </w:p>
+    <w:p>
+      <w:pPr>
+        <w:jc w:val="both"/>
+      </w:pPr>
+      <w:r>
+        <w:t>The two fits are worth holding against each other, since both are RMS deviations from the same target surface. The form finding reaches 1.05 mm in 9.3 s; the best of the inverse runs of Section 6.4.6 reaches 6.17 mm in an hour. The target is therefore very nearly attainable as a pure tension network, and the residual is not a failure of the form finding but the cost of realising that network in a knitted fabric of finite and directional stiffness, under the region and cable constraints the fabrication imposes. It is the materialisation, not the geometry, that the expensive optimisation is paying for.</w:t>
       </w:r>
     </w:p>
     <w:p>

</xml_diff>

<commit_message>
Put the force density form finding in the cost table
The table listed only inverse runs, so the stage they are being compared against
was absent from the one place a reader compares things. It is now the last row,
marked with a double dagger: 847/1563 mesh, 2410 design variables, 1173 solves at
6.85 ms, 9.3 s in total.

The caption says what makes that row unlike the others - an FDM equilibrium
rather than a membrane solve, an adjoint rather than a finite difference - which
is why 2410 variables cost less there than three do above.

Co-Authored-By: Claude Opus 5 (1M context) <noreply@anthropic.com>
</commit_message>
<xml_diff>
--- a/FDM/data/Section_6_5_1_Computational_time.docx
+++ b/FDM/data/Section_6_5_1_Computational_time.docx
@@ -1111,6 +1111,99 @@
           </w:p>
         </w:tc>
       </w:tr>
+      <w:tr>
+        <w:tc>
+          <w:tcPr>
+            <w:tcW w:type="dxa" w:w="1234"/>
+          </w:tcPr>
+          <w:p>
+            <w:r>
+              <w:rPr>
+                <w:sz w:val="16"/>
+              </w:rPr>
+              <w:t>Openings, force density form finding ‡</w:t>
+            </w:r>
+          </w:p>
+        </w:tc>
+        <w:tc>
+          <w:tcPr>
+            <w:tcW w:type="dxa" w:w="1234"/>
+          </w:tcPr>
+          <w:p>
+            <w:r>
+              <w:rPr>
+                <w:sz w:val="16"/>
+              </w:rPr>
+              <w:t>6.2</w:t>
+            </w:r>
+          </w:p>
+        </w:tc>
+        <w:tc>
+          <w:tcPr>
+            <w:tcW w:type="dxa" w:w="1234"/>
+          </w:tcPr>
+          <w:p>
+            <w:r>
+              <w:rPr>
+                <w:sz w:val="16"/>
+              </w:rPr>
+              <w:t>847 / 1563</w:t>
+            </w:r>
+          </w:p>
+        </w:tc>
+        <w:tc>
+          <w:tcPr>
+            <w:tcW w:type="dxa" w:w="1234"/>
+          </w:tcPr>
+          <w:p>
+            <w:r>
+              <w:rPr>
+                <w:sz w:val="16"/>
+              </w:rPr>
+              <w:t>2410</w:t>
+            </w:r>
+          </w:p>
+        </w:tc>
+        <w:tc>
+          <w:tcPr>
+            <w:tcW w:type="dxa" w:w="1234"/>
+          </w:tcPr>
+          <w:p>
+            <w:r>
+              <w:rPr>
+                <w:sz w:val="16"/>
+              </w:rPr>
+              <w:t>1173</w:t>
+            </w:r>
+          </w:p>
+        </w:tc>
+        <w:tc>
+          <w:tcPr>
+            <w:tcW w:type="dxa" w:w="1234"/>
+          </w:tcPr>
+          <w:p>
+            <w:r>
+              <w:rPr>
+                <w:sz w:val="16"/>
+              </w:rPr>
+              <w:t>0.007 s</w:t>
+            </w:r>
+          </w:p>
+        </w:tc>
+        <w:tc>
+          <w:tcPr>
+            <w:tcW w:type="dxa" w:w="1234"/>
+          </w:tcPr>
+          <w:p>
+            <w:r>
+              <w:rPr>
+                <w:sz w:val="16"/>
+              </w:rPr>
+              <w:t>9.3 s</w:t>
+            </w:r>
+          </w:p>
+        </w:tc>
+      </w:tr>
     </w:tbl>
     <w:p>
       <w:r>
@@ -1118,7 +1211,7 @@
           <w:i/>
           <w:sz w:val="18"/>
         </w:rPr>
-        <w:t>Table 6.X: Computational cost of the case studies. For the crease strategies the solve cost is the mean over the run itself, which is warm-started in process; entries marked * exclude the single non-converging solve discussed in the text. For the free-form shell, the fluted dome and the single-region fit it is the median over twenty-five design points about the optimum, each a cold solve. For the three region-scheme runs it is the median over the recorded run. Wall clocks marked † were lost when the output files were rewritten and are not measurements: they are the evaluation count times the median solve cost, and therefore lower bounds, since they credit the run with no non-converging solves at all. The three measured region-scheme runs exceed the same bound by factors of 11, 8 and 7 respectively, so the true figures are plausibly of the order of ten minutes rather than one.</w:t>
+        <w:t>Table 6.X: Computational cost of the case studies. For the crease strategies the solve cost is the mean over the run itself, which is warm-started in process; entries marked * exclude the single non-converging solve discussed in the text. For the free-form shell, the fluted dome and the single-region fit it is the median over twenty-five design points about the optimum, each a cold solve. For the three region-scheme runs it is the median over the recorded run. Wall clocks marked † were lost when the output files were rewritten and are not measurements: they are the evaluation count times the median solve cost, and therefore lower bounds, since they credit the run with no non-converging solves at all. The three measured region-scheme runs exceed the same bound by factors of 11, 8 and 7 respectively, so the true figures are plausibly of the order of ten minutes rather than one. The last row, marked ‡, is not an inverse problem but the form finding that precedes them all, on the same mesh as the shell with openings; its solve is an FDM equilibrium rather than a membrane solve and its gradient is an adjoint rather than a finite difference, which is why 2410 design variables cost less than three do in the rows above.</w:t>
       </w:r>
     </w:p>
     <w:p>
@@ -1126,7 +1219,7 @@
         <w:jc w:val="both"/>
       </w:pPr>
       <w:r>
-        <w:t>The table separates two populations that should not be averaged. The strategies with a global or symmetry-reduced parameter set converge in a few hundred evaluations and finish in one to two minutes of solve time: 622 evaluations for the free-form shell over thirty variables, 412 for the fluted dome across its two phases, 162 for the single-region fit of the shell with openings. The alternating region schemes are one to two orders of magnitude more expensive. The adaptive partition of the shell with openings took 2959 evaluations and 184 minutes, because every element on a region boundary is trial-assigned to each neighbouring region at one forward solve per trial, and the sweep repeats until no element moves. It is the discrete outer step, not the continuous inner one, that makes region refinement expensive, and its cost scales with the length of the region boundaries rather than with the number of variables. The twenty-variable field-aligned partition needed 1241 evaluations against the nine-variable adaptive partition's 2959.</w:t>
+        <w:t>The table separates two populations that should not be averaged. The strategies with a global or symmetry-reduced parameter set converge in a few hundred evaluations and finish in one to two minutes of solve time: 622 evaluations for the free-form shell over thirty variables, 412 for the fluted dome across its two phases, 162 for the single-region fit of the shell with openings. The alternating region schemes are one to two orders of magnitude more expensive. The adaptive partition of the shell with openings took 2959 evaluations and 184 minutes, because every element on a region boundary is trial-assigned to each neighbouring region at one forward solve per trial, and the sweep repeats until no element moves. It is the discrete outer step, not the continuous inner one, that makes region refinement expensive, and its cost scales with the length of the region boundaries rather than with the number of variables. The twenty-variable field-aligned partition needed 1241 evaluations against the nine-variable adaptive partition's 2959. The last row belongs to neither population, being the form finding that precedes the inverse problem rather than an instance of it; it is there for the comparison drawn below, and it is cheaper than every run on the same mesh despite carrying the largest design vector in the table by two orders of magnitude.</w:t>
       </w:r>
     </w:p>
     <w:p>

</xml_diff>

<commit_message>
Solve strategy E to 1e-6, as the rest of 6.4.1 does
The threshold in best_fit_stretch_factors_3region_adaptive.cpp was 1e-4 where
every other crease driver uses 1e-6. Aligned and re-run.

The result did not move. Same 554 solves, same partition at 175/131/328 faces,
same stretch factors to five decimals, same 6.14313 mm mean distance and 33 mm
maximum. Only the cost changed: 3.4 s to 11.4 s, and 6 ms to 21 ms per solve,
which sits alongside the 10 to 29 ms of strategies A to D. So the fit reported in
6.4.1 was never an artefact of the looser tolerance, and the table entry is now
comparable with the rows it is read against.

Note 10a keeps the remaining caveat, which the tolerance was never the cause of:
C's 53.4 s is one non-converging solve of about 51 s, so comparing its wall clock
with E's compares how often each strategy leaves the feasible set, not the work
each does per evaluation.

Co-Authored-By: Claude Opus 5 (1M context) <noreply@anthropic.com>
</commit_message>
<xml_diff>
--- a/FDM/data/Section_6_5_1_Computational_time.docx
+++ b/FDM/data/Section_6_5_1_Computational_time.docx
@@ -563,7 +563,7 @@
               <w:rPr>
                 <w:sz w:val="16"/>
               </w:rPr>
-              <w:t>Middle crease, 3 adaptive regions (E) ‖</w:t>
+              <w:t>Middle crease, 3 adaptive regions (E)</w:t>
             </w:r>
           </w:p>
         </w:tc>
@@ -628,7 +628,7 @@
               <w:rPr>
                 <w:sz w:val="16"/>
               </w:rPr>
-              <w:t>0.006 s</w:t>
+              <w:t>0.021 s</w:t>
             </w:r>
           </w:p>
         </w:tc>
@@ -641,7 +641,7 @@
               <w:rPr>
                 <w:sz w:val="16"/>
               </w:rPr>
-              <w:t>3.4 s</w:t>
+              <w:t>11.4 s</w:t>
             </w:r>
           </w:p>
         </w:tc>
@@ -1583,7 +1583,7 @@
           <w:i/>
           <w:sz w:val="18"/>
         </w:rPr>
-        <w:t>Table 6.X: Computational cost of the case studies. For the crease strategies the solve cost is the mean over the run itself, which is warm-started in process; entries marked * exclude the single non-converging solve discussed in the text. The entry marked ‖ was solved to a Newton threshold of 1e-4, where every other crease strategy used 1e-6, so neither its solve cost nor its wall clock is comparable with the four rows above it. For the free-form shell, the fluted dome and the single-region fit it is the median over twenty-five design points about the optimum, each a cold solve. For the three region-scheme runs it is the median over the recorded run. Wall clocks marked † were lost when the output files were rewritten and are not measurements: they are the evaluation count times the median solve cost, and therefore lower bounds, since they credit the run with no non-converging solves at all. The three measured region-scheme runs exceed the same bound by factors of 11, 8 and 7 respectively, so the true figures are plausibly of the order of ten minutes rather than one. The rows marked ‡ are not inverse problems but the form finding that precedes each of them, and for those rows the solve cost is one L-BFGS-B iteration — an equilibrium solve and a gradient — rather than a single membrane solve, so it is comparable within the block and not against the rows above. All three now use the adjoint gradient; the free-form shell and the fluted dome took 171 s and 34 min before it was ported into them, at the same fit, as discussed below. The entry marked § stopped at its iteration cap rather than at convergence, so it too is a floor, and the one marked ¶ is a fixed budget of ten gradient-descent steps with no convergence test at all, whose fit was still improving when it stopped; it also still uses direct sensitivity.</w:t>
+        <w:t>Table 6.X: Computational cost of the case studies. For the crease strategies the solve cost is the mean over the run itself, which is warm-started in process; entries marked * exclude the single non-converging solve discussed in the text. All five crease strategies are solved to the same Newton threshold of 1e-6. For the free-form shell, the fluted dome and the single-region fit it is the median over twenty-five design points about the optimum, each a cold solve. For the three region-scheme runs it is the median over the recorded run. Wall clocks marked † were lost when the output files were rewritten and are not measurements: they are the evaluation count times the median solve cost, and therefore lower bounds, since they credit the run with no non-converging solves at all. The three measured region-scheme runs exceed the same bound by factors of 11, 8 and 7 respectively, so the true figures are plausibly of the order of ten minutes rather than one. The rows marked ‡ are not inverse problems but the form finding that precedes each of them, and for those rows the solve cost is one L-BFGS-B iteration — an equilibrium solve and a gradient — rather than a single membrane solve, so it is comparable within the block and not against the rows above. All three now use the adjoint gradient; the free-form shell and the fluted dome took 171 s and 34 min before it was ported into them, at the same fit, as discussed below. The entry marked § stopped at its iteration cap rather than at convergence, so it too is a floor, and the one marked ¶ is a fixed budget of ten gradient-descent steps with no convergence test at all, whose fit was still improving when it stopped; it also still uses direct sensitivity.</w:t>
       </w:r>
     </w:p>
     <w:p>
@@ -1940,7 +1940,15 @@
         <w:pStyle w:val="ListBullet"/>
       </w:pPr>
       <w:r>
-        <w:t>10. Strategy E looks an order of magnitude faster than strategy C and is not. Two things account for the gap, and neither is that the adaptive scheme is cheaper. First, C's 53.4 s is one solve: the single design point at which Newton exhausted its iteration limit cost about 51 s, so C's other 92 solves account for roughly 2.2 s, against E's 3.4 s for 554 solves — the same order of magnitude of productive work. Second, best_fit_stretch_factors_3region_adaptive.cpp sets the Newton threshold to 1e-4 where every other crease driver sets 1e-6, which both lowers its per-solve cost and lets it leave a badly conditioned design point that the others would grind on. It is the only driver in the set with a different tolerance, and it is not clear the difference was intentional. Either the tolerance should be brought into line and the run repeated, or the text should say why strategy E is solved less tightly than the strategies it is compared against in 6.4.1.</w:t>
+        <w:t>10. Strategy E was originally solved to a Newton threshold of 1e-4 where every other crease driver uses 1e-6. It has been brought into line and re-run, and the table reports the 1e-6 figures. The result did not move: the same 554 solves, the same region partition at 175/131/328 faces, the same stretch factors to five decimals, the same 6.14313 mm mean distance. Only the cost changed, from 3.4 s to 11.4 s, and the per-solve cost from 6 ms to 21 ms, which puts it alongside the 10 to 29 ms of strategies A to D. The reported fit of 6.4.1 therefore stands as printed, and was never an artefact of the looser tolerance.</w:t>
+      </w:r>
+    </w:p>
+    <w:p>
+      <w:pPr>
+        <w:pStyle w:val="ListBullet"/>
+      </w:pPr>
+      <w:r>
+        <w:t>10a. Strategy E is still not comparable with strategy C in the way the wall clocks suggest, but for a different reason. C's 53.4 s is one solve: the single design point at which Newton exhausted its iteration limit cost about 51 s, leaving roughly 2.2 s for its other 92. E performs 554 solves at a similar unit cost without meeting such a point. The comparison between them is a comparison of how often each strategy wanders outside the feasible set, not of the work each does per evaluation.</w:t>
       </w:r>
     </w:p>
     <w:p>

</xml_diff>